<commit_message>
Rewrite the mentor reports as separate notes.
Each file stands on its own, with one linking sentence at each end, and the earlier single report is kept beside the series.
</commit_message>
<xml_diff>
--- a/docs/progress/01_companion.docx
+++ b/docs/progress/01_companion.docx
@@ -12,7 +12,7 @@
           <w:b/>
           <w:sz w:val="24"/>
         </w:rPr>
-        <w:t>Progress report 1 of 10</w:t>
+        <w:t>Thesis progress report</w:t>
       </w:r>
     </w:p>
     <w:p>
@@ -64,7 +64,7 @@
           <w:b w:val="0"/>
           <w:sz w:val="24"/>
         </w:rPr>
-        <w:t>This is the first progress note.</w:t>
+        <w:t>A small drone splits the work in two. PX4, on the flight controller, keeps the aircraft in the air. A Linux computer beside it has to run the camera network, and it has to finish before the next frame is due.</w:t>
       </w:r>
     </w:p>
     <w:p>
@@ -77,7 +77,7 @@
           <w:b w:val="0"/>
           <w:sz w:val="24"/>
         </w:rPr>
-        <w:t>A small drone splits the work. PX4 on the flight controller keeps the aircraft in the air. A Linux computer beside it has to run the camera network, and it has to keep up with the frames.</w:t>
+        <w:t>That second computer is the companion. It is where people, vehicles, a landing patch, or a depth cue would be recognised. The flight controller does not run those networks. If the companion is late, the aircraft is still flying, but it is flying without the picture.</w:t>
       </w:r>
     </w:p>
     <w:p>
@@ -90,7 +90,7 @@
           <w:b w:val="0"/>
           <w:sz w:val="24"/>
         </w:rPr>
-        <w:t>A compile recipe is the set of choices that turn a trained network into a file that can run: which joins of operations to allow, whether weights are 8-bit, and how many CPU threads to use. People still pick that recipe by habit. A recipe that is fast on a desktop GPU is often slow, or numerically wrong, on a small ARM CPU.</w:t>
+        <w:t>Turning a trained network into something the companion can run is a compile recipe. The recipe chooses which operations may be joined, whether the weights stay in 32-bit or drop to 8-bit, and how many CPU threads are used. In practice that recipe is still picked by habit. A choice that is fast on a desktop GPU is often slow on a four-core ARM CPU, and an 8-bit version can be both faster and numerically wrong.</w:t>
       </w:r>
     </w:p>
     <w:p>
@@ -103,77 +103,7 @@
           <w:b w:val="0"/>
           <w:sz w:val="24"/>
         </w:rPr>
-        <w:t>The lab stack had to be named before any compiler was written.</w:t>
-      </w:r>
-    </w:p>
-    <w:p>
-      <w:pPr>
-        <w:pStyle w:val="ListBullet"/>
-        <w:spacing w:after="40"/>
-      </w:pPr>
-      <w:r>
-        <w:rPr>
-          <w:rFonts w:ascii="Liberation Serif" w:hAnsi="Liberation Serif" w:eastAsia="Liberation Serif"/>
-          <w:b w:val="0"/>
-          <w:sz w:val="22"/>
-        </w:rPr>
-        <w:t>The companion computer runs the camera network. The flight controller does not.</w:t>
-      </w:r>
-    </w:p>
-    <w:p>
-      <w:pPr>
-        <w:pStyle w:val="ListBullet"/>
-        <w:spacing w:after="40"/>
-      </w:pPr>
-      <w:r>
-        <w:rPr>
-          <w:rFonts w:ascii="Liberation Serif" w:hAnsi="Liberation Serif" w:eastAsia="Liberation Serif"/>
-          <w:b w:val="0"/>
-          <w:sz w:val="22"/>
-        </w:rPr>
-        <w:t>PX4 is the flight stack, including in simulation.</w:t>
-      </w:r>
-    </w:p>
-    <w:p>
-      <w:pPr>
-        <w:pStyle w:val="ListBullet"/>
-        <w:spacing w:after="40"/>
-      </w:pPr>
-      <w:r>
-        <w:rPr>
-          <w:rFonts w:ascii="Liberation Serif" w:hAnsi="Liberation Serif" w:eastAsia="Liberation Serif"/>
-          <w:b w:val="0"/>
-          <w:sz w:val="22"/>
-        </w:rPr>
-        <w:t>Gazebo is the world the aircraft flies in.</w:t>
-      </w:r>
-    </w:p>
-    <w:p>
-      <w:pPr>
-        <w:pStyle w:val="ListBullet"/>
-        <w:spacing w:after="40"/>
-      </w:pPr>
-      <w:r>
-        <w:rPr>
-          <w:rFonts w:ascii="Liberation Serif" w:hAnsi="Liberation Serif" w:eastAsia="Liberation Serif"/>
-          <w:b w:val="0"/>
-          <w:sz w:val="22"/>
-        </w:rPr>
-        <w:t>ROS 2 carries messages between programs.</w:t>
-      </w:r>
-    </w:p>
-    <w:p>
-      <w:pPr>
-        <w:pStyle w:val="ListBullet"/>
-        <w:spacing w:after="40"/>
-      </w:pPr>
-      <w:r>
-        <w:rPr>
-          <w:rFonts w:ascii="Liberation Serif" w:hAnsi="Liberation Serif" w:eastAsia="Liberation Serif"/>
-          <w:b w:val="0"/>
-          <w:sz w:val="22"/>
-        </w:rPr>
-        <w:t>ONNX stores the network as a graph of operations.</w:t>
+        <w:t>The lab tools around that computer had to be named before any compiler was written. PX4 is the flight stack, in the air and in simulation. Gazebo is the simulated world. ROS 2 is the message bus: programs publish and subscribe on topics, they do not call each other directly. ONNX is the file that holds a trained network as a graph of operations and tensors, which is the object a compiler can inspect.</w:t>
       </w:r>
     </w:p>
     <w:p>
@@ -186,19 +116,14 @@
           <w:b w:val="0"/>
           <w:sz w:val="24"/>
         </w:rPr>
-        <w:t>A camera that sends a frame every 33 ms does not leave much time. If the network, and the compile choices around it, use more than that, frames are dropped. That is why the recipe is part of the thesis, not a setup detail.</w:t>
-      </w:r>
-    </w:p>
-    <w:p>
-      <w:r>
-        <w:br w:type="page"/>
+        <w:t>A camera that produces a frame about every 33 ms does not leave a large budget. If the network and the recipe around it take longer than that, frames are dropped. The recipe is therefore part of the research problem, not a setup step that can be left to taste.</w:t>
       </w:r>
     </w:p>
     <w:p>
       <w:r>
         <w:drawing>
           <wp:inline xmlns:a="http://schemas.openxmlformats.org/drawingml/2006/main" xmlns:pic="http://schemas.openxmlformats.org/drawingml/2006/picture">
-            <wp:extent cx="5669280" cy="7215447"/>
+            <wp:extent cx="5303520" cy="6749935"/>
             <wp:docPr id="1" name="Picture 1"/>
             <wp:cNvGraphicFramePr>
               <a:graphicFrameLocks noChangeAspect="1"/>
@@ -219,7 +144,7 @@
                   <pic:spPr>
                     <a:xfrm>
                       <a:off x="0" y="0"/>
-                      <a:ext cx="5669280" cy="7215447"/>
+                      <a:ext cx="5303520" cy="6749935"/>
                     </a:xfrm>
                     <a:prstGeom prst="rect"/>
                   </pic:spPr>
@@ -240,7 +165,7 @@
           <w:b w:val="0"/>
           <w:sz w:val="20"/>
         </w:rPr>
-        <w:t>Figure 1. Flight stays on PX4. The camera network stays on the companion computer.</w:t>
+        <w:t>Figure 1. PX4 flies. The companion computer is the only place the camera network runs.</w:t>
       </w:r>
     </w:p>
     <w:p>
@@ -253,7 +178,7 @@
           <w:b w:val="0"/>
           <w:sz w:val="24"/>
         </w:rPr>
-        <w:t>Flight and vision are separate jobs. The next note asks who is allowed to choose the compile recipe.</w:t>
+        <w:t>Flight and vision are separate. What is still open is who is allowed to choose the compile recipe.</w:t>
       </w:r>
     </w:p>
     <w:sectPr>

</xml_diff>

<commit_message>
Write the mentor reports as the path that was actually taken.
Each note now records the first assumption, the mistake it caused, and the rule that replaced it.
</commit_message>
<xml_diff>
--- a/docs/progress/01_companion.docx
+++ b/docs/progress/01_companion.docx
@@ -117,6 +117,19 @@
           <w:sz w:val="24"/>
         </w:rPr>
         <w:t>A camera that produces a frame about every 33 ms does not leave a large budget. If the network and the recipe around it take longer than that, frames are dropped. The recipe is therefore part of the research problem, not a setup step that can be left to taste.</w:t>
+      </w:r>
+    </w:p>
+    <w:p>
+      <w:pPr>
+        <w:spacing w:after="160" w:before="40" w:line="276" w:lineRule="auto"/>
+      </w:pPr>
+      <w:r>
+        <w:rPr>
+          <w:rFonts w:ascii="Liberation Serif" w:hAnsi="Liberation Serif" w:eastAsia="Liberation Serif"/>
+          <w:b w:val="0"/>
+          <w:sz w:val="24"/>
+        </w:rPr>
+        <w:t>The first sketch treated the drone as one AI program. That was the wrong cut. PX4 already flies. Putting the camera network on the flight controller would mix a vision bug with a control bug, and a compile result would have nowhere honest to run. So the early work was the stack itself: a simulated aircraft, a camera, and a message bus, before any optimizer existed. The principle that survived is small. The science is the recipe on the companion. It is not a new autopilot.</w:t>
       </w:r>
     </w:p>
     <w:p>

</xml_diff>